<commit_message>
Fix beta release safety and packaging
</commit_message>
<xml_diff>
--- a/beta/ARCHive_Beta_Test_Questionnaire.docx
+++ b/beta/ARCHive_Beta_Test_Questionnaire.docx
@@ -132,7 +132,7 @@
                 <w:color w:val="6B7280"/>
                 <w:sz w:val="19"/>
               </w:rPr>
-              <w:t>1.0.0-beta1</w:t>
+              <w:t>1.2.1-beta4</w:t>
             </w:r>
           </w:p>
         </w:tc>
@@ -7385,7 +7385,7 @@
               <w:color w:val="6B7280"/>
               <w:sz w:val="18"/>
             </w:rPr>
-            <w:t>Seven-Day Beta • 1.0.0-beta1</w:t>
+            <w:t>Seven-Day Beta • 1.2.1-beta4</w:t>
           </w:r>
         </w:p>
       </w:tc>

</xml_diff>